<commit_message>
stable version, create consensus middleware, front send transaction, need backend transac handler
</commit_message>
<xml_diff>
--- a/block/Block chain.docx
+++ b/block/Block chain.docx
@@ -1,6 +1,6 @@
 
 <file path=word/document.xml><?xml version="1.0" encoding="utf-8"?>
-<w:document xmlns:wpc="http://schemas.microsoft.com/office/word/2010/wordprocessingCanvas" xmlns:cx="http://schemas.microsoft.com/office/drawing/2014/chartex" xmlns:cx1="http://schemas.microsoft.com/office/drawing/2015/9/8/chartex" xmlns:cx2="http://schemas.microsoft.com/office/drawing/2015/10/21/chartex" xmlns:cx3="http://schemas.microsoft.com/office/drawing/2016/5/9/chartex" xmlns:cx4="http://schemas.microsoft.com/office/drawing/2016/5/10/chartex" xmlns:cx5="http://schemas.microsoft.com/office/drawing/2016/5/11/chartex" xmlns:cx6="http://schemas.microsoft.com/office/drawing/2016/5/12/chartex" xmlns:cx7="http://schemas.microsoft.com/office/drawing/2016/5/13/chartex" xmlns:cx8="http://schemas.microsoft.com/office/drawing/2016/5/14/chartex" xmlns:mc="http://schemas.openxmlformats.org/markup-compatibility/2006" xmlns:aink="http://schemas.microsoft.com/office/drawing/2016/ink" xmlns:am3d="http://schemas.microsoft.com/office/drawing/2017/model3d" xmlns:o="urn:schemas-microsoft-com:office:office" xmlns:oel="http://schemas.microsoft.com/office/2019/extlst" xmlns:r="http://schemas.openxmlformats.org/officeDocument/2006/relationships" xmlns:m="http://schemas.openxmlformats.org/officeDocument/2006/math" xmlns:v="urn:schemas-microsoft-com:vml" xmlns:wp14="http://schemas.microsoft.com/office/word/2010/wordprocessingDrawing" xmlns:wp="http://schemas.openxmlformats.org/drawingml/2006/wordprocessingDrawing" xmlns:w10="urn:schemas-microsoft-com:office:word" xmlns:w="http://schemas.openxmlformats.org/wordprocessingml/2006/main" xmlns:w14="http://schemas.microsoft.com/office/word/2010/wordml" xmlns:w15="http://schemas.microsoft.com/office/word/2012/wordml" xmlns:w16cex="http://schemas.microsoft.com/office/word/2018/wordml/cex" xmlns:w16cid="http://schemas.microsoft.com/office/word/2016/wordml/cid" xmlns:w16="http://schemas.microsoft.com/office/word/2018/wordml" xmlns:w16du="http://schemas.microsoft.com/office/word/2023/wordml/word16du" xmlns:w16sdtdh="http://schemas.microsoft.com/office/word/2020/wordml/sdtdatahash" xmlns:w16se="http://schemas.microsoft.com/office/word/2015/wordml/symex" xmlns:wpg="http://schemas.microsoft.com/office/word/2010/wordprocessingGroup" xmlns:wpi="http://schemas.microsoft.com/office/word/2010/wordprocessingInk" xmlns:wne="http://schemas.microsoft.com/office/word/2006/wordml" xmlns:wps="http://schemas.microsoft.com/office/word/2010/wordprocessingShape" mc:Ignorable="w14 w15 w16se w16cid w16 w16cex w16sdtdh w16du wp14">
+<w:document xmlns:wpc="http://schemas.microsoft.com/office/word/2010/wordprocessingCanvas" xmlns:cx="http://schemas.microsoft.com/office/drawing/2014/chartex" xmlns:cx1="http://schemas.microsoft.com/office/drawing/2015/9/8/chartex" xmlns:cx2="http://schemas.microsoft.com/office/drawing/2015/10/21/chartex" xmlns:cx3="http://schemas.microsoft.com/office/drawing/2016/5/9/chartex" xmlns:cx4="http://schemas.microsoft.com/office/drawing/2016/5/10/chartex" xmlns:cx5="http://schemas.microsoft.com/office/drawing/2016/5/11/chartex" xmlns:cx6="http://schemas.microsoft.com/office/drawing/2016/5/12/chartex" xmlns:cx7="http://schemas.microsoft.com/office/drawing/2016/5/13/chartex" xmlns:cx8="http://schemas.microsoft.com/office/drawing/2016/5/14/chartex" xmlns:mc="http://schemas.openxmlformats.org/markup-compatibility/2006" xmlns:aink="http://schemas.microsoft.com/office/drawing/2016/ink" xmlns:am3d="http://schemas.microsoft.com/office/drawing/2017/model3d" xmlns:o="urn:schemas-microsoft-com:office:office" xmlns:oel="http://schemas.microsoft.com/office/2019/extlst" xmlns:r="http://schemas.openxmlformats.org/officeDocument/2006/relationships" xmlns:m="http://schemas.openxmlformats.org/officeDocument/2006/math" xmlns:v="urn:schemas-microsoft-com:vml" xmlns:wp14="http://schemas.microsoft.com/office/word/2010/wordprocessingDrawing" xmlns:wp="http://schemas.openxmlformats.org/drawingml/2006/wordprocessingDrawing" xmlns:w10="urn:schemas-microsoft-com:office:word" xmlns:w="http://schemas.openxmlformats.org/wordprocessingml/2006/main" xmlns:w14="http://schemas.microsoft.com/office/word/2010/wordml" xmlns:w15="http://schemas.microsoft.com/office/word/2012/wordml" xmlns:w16cex="http://schemas.microsoft.com/office/word/2018/wordml/cex" xmlns:w16cid="http://schemas.microsoft.com/office/word/2016/wordml/cid" xmlns:w16="http://schemas.microsoft.com/office/word/2018/wordml" xmlns:w16du="http://schemas.microsoft.com/office/word/2023/wordml/word16du" xmlns:w16sdtdh="http://schemas.microsoft.com/office/word/2020/wordml/sdtdatahash" xmlns:w16sdtfl="http://schemas.microsoft.com/office/word/2024/wordml/sdtformatlock" xmlns:w16se="http://schemas.microsoft.com/office/word/2015/wordml/symex" xmlns:wpg="http://schemas.microsoft.com/office/word/2010/wordprocessingGroup" xmlns:wpi="http://schemas.microsoft.com/office/word/2010/wordprocessingInk" xmlns:wne="http://schemas.microsoft.com/office/word/2006/wordml" xmlns:wps="http://schemas.microsoft.com/office/word/2010/wordprocessingShape" mc:Ignorable="w14 w15 w16se w16cid w16 w16cex w16sdtdh w16sdtfl w16du wp14">
   <w:body>
     <w:p>
       <w:pPr>
@@ -394,21 +394,7 @@
         <w:rPr>
           <w:lang w:val="fr-FR"/>
         </w:rPr>
-        <w:t xml:space="preserve"> on ne peut afficher directement </w:t>
-      </w:r>
-      <w:proofErr w:type="gramStart"/>
-      <w:r>
-        <w:rPr>
-          <w:lang w:val="fr-FR"/>
-        </w:rPr>
-        <w:t>les retour</w:t>
-      </w:r>
-      <w:proofErr w:type="gramEnd"/>
-      <w:r>
-        <w:rPr>
-          <w:lang w:val="fr-FR"/>
-        </w:rPr>
-        <w:t xml:space="preserve"> des socket</w:t>
+        <w:t xml:space="preserve"> on ne peut afficher directement les retour des socket</w:t>
       </w:r>
       <w:r>
         <w:rPr>
@@ -735,21 +721,7 @@
         <w:rPr>
           <w:lang w:val="fr-FR"/>
         </w:rPr>
-        <w:t xml:space="preserve"> </w:t>
-      </w:r>
-      <w:proofErr w:type="gramStart"/>
-      <w:r>
-        <w:rPr>
-          <w:lang w:val="fr-FR"/>
-        </w:rPr>
-        <w:t>la block</w:t>
-      </w:r>
-      <w:proofErr w:type="gramEnd"/>
-      <w:r>
-        <w:rPr>
-          <w:lang w:val="fr-FR"/>
-        </w:rPr>
-        <w:t xml:space="preserve"> </w:t>
+        <w:t xml:space="preserve"> la block </w:t>
       </w:r>
       <w:proofErr w:type="spellStart"/>
       <w:r>
@@ -1076,27 +1048,13 @@
         <w:rPr>
           <w:lang w:val="fr-FR"/>
         </w:rPr>
-        <w:t xml:space="preserve"> approuvé par le </w:t>
-      </w:r>
-      <w:proofErr w:type="gramStart"/>
-      <w:r>
-        <w:rPr>
-          <w:lang w:val="fr-FR"/>
-        </w:rPr>
-        <w:t xml:space="preserve">système </w:t>
-      </w:r>
-      <w:r>
-        <w:rPr>
-          <w:lang w:val="fr-FR"/>
-        </w:rPr>
-        <w:t>)</w:t>
-      </w:r>
-      <w:proofErr w:type="gramEnd"/>
-      <w:r>
-        <w:rPr>
-          <w:lang w:val="fr-FR"/>
-        </w:rPr>
-        <w:t>.</w:t>
+        <w:t xml:space="preserve"> approuvé par le système </w:t>
+      </w:r>
+      <w:r>
+        <w:rPr>
+          <w:lang w:val="fr-FR"/>
+        </w:rPr>
+        <w:t>).</w:t>
       </w:r>
     </w:p>
     <w:p>
@@ -1251,6 +1209,7 @@
       </w:pPr>
       <w:r>
         <w:rPr>
+          <w:noProof/>
           <w:lang w:val="fr-FR"/>
         </w:rPr>
         <w:drawing>
@@ -1441,6 +1400,7 @@
       </w:pPr>
       <w:r>
         <w:rPr>
+          <w:noProof/>
           <w:lang w:val="fr-FR"/>
         </w:rPr>
         <w:drawing>
@@ -1854,21 +1814,7 @@
         <w:rPr>
           <w:lang w:val="fr-FR"/>
         </w:rPr>
-        <w:t xml:space="preserve">Chaque nœud du consensus (membre relais tiers) </w:t>
-      </w:r>
-      <w:proofErr w:type="gramStart"/>
-      <w:r>
-        <w:rPr>
-          <w:lang w:val="fr-FR"/>
-        </w:rPr>
-        <w:t>vont</w:t>
-      </w:r>
-      <w:proofErr w:type="gramEnd"/>
-      <w:r>
-        <w:rPr>
-          <w:lang w:val="fr-FR"/>
-        </w:rPr>
-        <w:t xml:space="preserve"> alors recevoir le transaction chiffré (et ne dispose pas de clef pour le déchiffrer), vont chacun générer un hash de </w:t>
+        <w:t xml:space="preserve">Chaque nœud du consensus (membre relais tiers) vont alors recevoir le transaction chiffré (et ne dispose pas de clef pour le déchiffrer), vont chacun générer un hash de </w:t>
       </w:r>
       <w:r>
         <w:rPr>
@@ -2194,31 +2140,186 @@
           <w:bCs/>
           <w:lang w:val="fr-FR"/>
         </w:rPr>
-        <w:t xml:space="preserve">A chaque échange avec </w:t>
-      </w:r>
-      <w:proofErr w:type="gramStart"/>
-      <w:r>
-        <w:rPr>
-          <w:b/>
-          <w:bCs/>
-          <w:lang w:val="fr-FR"/>
-        </w:rPr>
-        <w:t>la block</w:t>
-      </w:r>
-      <w:proofErr w:type="gramEnd"/>
-      <w:r>
-        <w:rPr>
-          <w:b/>
-          <w:bCs/>
+        <w:t xml:space="preserve">A chaque échange avec la block </w:t>
+      </w:r>
+      <w:proofErr w:type="spellStart"/>
+      <w:r>
+        <w:rPr>
+          <w:b/>
+          <w:bCs/>
+          <w:lang w:val="fr-FR"/>
+        </w:rPr>
+        <w:t>chain</w:t>
+      </w:r>
+      <w:proofErr w:type="spellEnd"/>
+      <w:r>
+        <w:rPr>
+          <w:b/>
+          <w:bCs/>
+          <w:lang w:val="fr-FR"/>
+        </w:rPr>
+        <w:t xml:space="preserve">, l’intégrité des </w:t>
+      </w:r>
+      <w:proofErr w:type="spellStart"/>
+      <w:r>
+        <w:rPr>
+          <w:b/>
+          <w:bCs/>
+          <w:lang w:val="fr-FR"/>
+        </w:rPr>
+        <w:t>wallet</w:t>
+      </w:r>
+      <w:proofErr w:type="spellEnd"/>
+      <w:r>
+        <w:rPr>
+          <w:b/>
+          <w:bCs/>
+          <w:lang w:val="fr-FR"/>
+        </w:rPr>
+        <w:t xml:space="preserve"> des 2 parties de la transaction doivent être vérifiée</w:t>
+      </w:r>
+      <w:r>
+        <w:rPr>
+          <w:lang w:val="fr-FR"/>
+        </w:rPr>
+        <w:t xml:space="preserve"> afin de leur permettre d’</w:t>
+      </w:r>
+      <w:proofErr w:type="spellStart"/>
+      <w:r>
+        <w:rPr>
+          <w:lang w:val="fr-FR"/>
+        </w:rPr>
+        <w:t>éffectuer</w:t>
+      </w:r>
+      <w:proofErr w:type="spellEnd"/>
+      <w:r>
+        <w:rPr>
           <w:lang w:val="fr-FR"/>
         </w:rPr>
         <w:t xml:space="preserve"> </w:t>
       </w:r>
+      <w:r>
+        <w:rPr>
+          <w:lang w:val="fr-FR"/>
+        </w:rPr>
+        <w:t xml:space="preserve">la transaction et ainsi l’indexation sur la </w:t>
+      </w:r>
       <w:proofErr w:type="spellStart"/>
       <w:r>
         <w:rPr>
-          <w:b/>
-          <w:bCs/>
+          <w:lang w:val="fr-FR"/>
+        </w:rPr>
+        <w:t>blockChain</w:t>
+      </w:r>
+      <w:proofErr w:type="spellEnd"/>
+      <w:r>
+        <w:rPr>
+          <w:lang w:val="fr-FR"/>
+        </w:rPr>
+        <w:t>.</w:t>
+      </w:r>
+    </w:p>
+    <w:p>
+      <w:pPr>
+        <w:rPr>
+          <w:lang w:val="fr-FR"/>
+        </w:rPr>
+      </w:pPr>
+      <w:r>
+        <w:rPr>
+          <w:lang w:val="fr-FR"/>
+        </w:rPr>
+        <w:t>Cette opération</w:t>
+      </w:r>
+      <w:r>
+        <w:rPr>
+          <w:lang w:val="fr-FR"/>
+        </w:rPr>
+        <w:t xml:space="preserve"> est indispensable sinon </w:t>
+      </w:r>
+      <w:r>
+        <w:rPr>
+          <w:lang w:val="fr-FR"/>
+        </w:rPr>
+        <w:t>n’importe</w:t>
+      </w:r>
+      <w:r>
+        <w:rPr>
+          <w:lang w:val="fr-FR"/>
+        </w:rPr>
+        <w:t xml:space="preserve"> </w:t>
+      </w:r>
+      <w:r>
+        <w:rPr>
+          <w:lang w:val="fr-FR"/>
+        </w:rPr>
+        <w:t>quel individu mal intentionné</w:t>
+      </w:r>
+      <w:r>
+        <w:rPr>
+          <w:lang w:val="fr-FR"/>
+        </w:rPr>
+        <w:t xml:space="preserve"> peut truquer son </w:t>
+      </w:r>
+      <w:proofErr w:type="spellStart"/>
+      <w:r>
+        <w:rPr>
+          <w:lang w:val="fr-FR"/>
+        </w:rPr>
+        <w:t>wallet</w:t>
+      </w:r>
+      <w:proofErr w:type="spellEnd"/>
+      <w:r>
+        <w:rPr>
+          <w:lang w:val="fr-FR"/>
+        </w:rPr>
+        <w:t xml:space="preserve"> et se rajouter des transaction factice </w:t>
+      </w:r>
+      <w:r>
+        <w:rPr>
+          <w:lang w:val="fr-FR"/>
+        </w:rPr>
+        <w:t>(sauf</w:t>
+      </w:r>
+      <w:r>
+        <w:rPr>
+          <w:lang w:val="fr-FR"/>
+        </w:rPr>
+        <w:t xml:space="preserve"> que les hash étant chainé</w:t>
+      </w:r>
+      <w:r>
+        <w:rPr>
+          <w:lang w:val="fr-FR"/>
+        </w:rPr>
+        <w:t xml:space="preserve"> entre eux</w:t>
+      </w:r>
+      <w:r>
+        <w:rPr>
+          <w:lang w:val="fr-FR"/>
+        </w:rPr>
+        <w:t xml:space="preserve"> ne pourront en aucun cas correspondre </w:t>
+      </w:r>
+      <w:r>
+        <w:rPr>
+          <w:lang w:val="fr-FR"/>
+        </w:rPr>
+        <w:t>aux indexations</w:t>
+      </w:r>
+      <w:r>
+        <w:rPr>
+          <w:lang w:val="fr-FR"/>
+        </w:rPr>
+        <w:t xml:space="preserve"> faites</w:t>
+      </w:r>
+      <w:r>
+        <w:rPr>
+          <w:lang w:val="fr-FR"/>
+        </w:rPr>
+        <w:t xml:space="preserve"> sur la block </w:t>
+      </w:r>
+      <w:proofErr w:type="spellStart"/>
+      <w:r>
+        <w:rPr>
           <w:lang w:val="fr-FR"/>
         </w:rPr>
         <w:t>chain</w:t>
@@ -2226,193 +2327,6 @@
       <w:proofErr w:type="spellEnd"/>
       <w:r>
         <w:rPr>
-          <w:b/>
-          <w:bCs/>
-          <w:lang w:val="fr-FR"/>
-        </w:rPr>
-        <w:t xml:space="preserve">, l’intégrité des </w:t>
-      </w:r>
-      <w:proofErr w:type="spellStart"/>
-      <w:r>
-        <w:rPr>
-          <w:b/>
-          <w:bCs/>
-          <w:lang w:val="fr-FR"/>
-        </w:rPr>
-        <w:t>wallet</w:t>
-      </w:r>
-      <w:proofErr w:type="spellEnd"/>
-      <w:r>
-        <w:rPr>
-          <w:b/>
-          <w:bCs/>
-          <w:lang w:val="fr-FR"/>
-        </w:rPr>
-        <w:t xml:space="preserve"> des 2 parties de la transaction doivent être vérifiée</w:t>
-      </w:r>
-      <w:r>
-        <w:rPr>
-          <w:lang w:val="fr-FR"/>
-        </w:rPr>
-        <w:t xml:space="preserve"> afin de leur permettre d’</w:t>
-      </w:r>
-      <w:proofErr w:type="spellStart"/>
-      <w:r>
-        <w:rPr>
-          <w:lang w:val="fr-FR"/>
-        </w:rPr>
-        <w:t>éffectuer</w:t>
-      </w:r>
-      <w:proofErr w:type="spellEnd"/>
-      <w:r>
-        <w:rPr>
-          <w:lang w:val="fr-FR"/>
-        </w:rPr>
-        <w:t xml:space="preserve"> </w:t>
-      </w:r>
-      <w:r>
-        <w:rPr>
-          <w:lang w:val="fr-FR"/>
-        </w:rPr>
-        <w:t xml:space="preserve">la transaction et ainsi l’indexation sur la </w:t>
-      </w:r>
-      <w:proofErr w:type="spellStart"/>
-      <w:r>
-        <w:rPr>
-          <w:lang w:val="fr-FR"/>
-        </w:rPr>
-        <w:t>blockChain</w:t>
-      </w:r>
-      <w:proofErr w:type="spellEnd"/>
-      <w:r>
-        <w:rPr>
-          <w:lang w:val="fr-FR"/>
-        </w:rPr>
-        <w:t>.</w:t>
-      </w:r>
-    </w:p>
-    <w:p>
-      <w:pPr>
-        <w:rPr>
-          <w:lang w:val="fr-FR"/>
-        </w:rPr>
-      </w:pPr>
-      <w:r>
-        <w:rPr>
-          <w:lang w:val="fr-FR"/>
-        </w:rPr>
-        <w:t>Cette opération</w:t>
-      </w:r>
-      <w:r>
-        <w:rPr>
-          <w:lang w:val="fr-FR"/>
-        </w:rPr>
-        <w:t xml:space="preserve"> est indispensable sinon </w:t>
-      </w:r>
-      <w:r>
-        <w:rPr>
-          <w:lang w:val="fr-FR"/>
-        </w:rPr>
-        <w:t>n’importe</w:t>
-      </w:r>
-      <w:r>
-        <w:rPr>
-          <w:lang w:val="fr-FR"/>
-        </w:rPr>
-        <w:t xml:space="preserve"> </w:t>
-      </w:r>
-      <w:r>
-        <w:rPr>
-          <w:lang w:val="fr-FR"/>
-        </w:rPr>
-        <w:t>quel individu mal intentionné</w:t>
-      </w:r>
-      <w:r>
-        <w:rPr>
-          <w:lang w:val="fr-FR"/>
-        </w:rPr>
-        <w:t xml:space="preserve"> peut truquer son </w:t>
-      </w:r>
-      <w:proofErr w:type="spellStart"/>
-      <w:r>
-        <w:rPr>
-          <w:lang w:val="fr-FR"/>
-        </w:rPr>
-        <w:t>wallet</w:t>
-      </w:r>
-      <w:proofErr w:type="spellEnd"/>
-      <w:r>
-        <w:rPr>
-          <w:lang w:val="fr-FR"/>
-        </w:rPr>
-        <w:t xml:space="preserve"> et se rajouter des transaction factice </w:t>
-      </w:r>
-      <w:r>
-        <w:rPr>
-          <w:lang w:val="fr-FR"/>
-        </w:rPr>
-        <w:t>(sauf</w:t>
-      </w:r>
-      <w:r>
-        <w:rPr>
-          <w:lang w:val="fr-FR"/>
-        </w:rPr>
-        <w:t xml:space="preserve"> que les hash étant chainé</w:t>
-      </w:r>
-      <w:r>
-        <w:rPr>
-          <w:lang w:val="fr-FR"/>
-        </w:rPr>
-        <w:t xml:space="preserve"> entre eux</w:t>
-      </w:r>
-      <w:r>
-        <w:rPr>
-          <w:lang w:val="fr-FR"/>
-        </w:rPr>
-        <w:t xml:space="preserve"> ne pourront en aucun cas correspondre </w:t>
-      </w:r>
-      <w:r>
-        <w:rPr>
-          <w:lang w:val="fr-FR"/>
-        </w:rPr>
-        <w:t>aux indexations</w:t>
-      </w:r>
-      <w:r>
-        <w:rPr>
-          <w:lang w:val="fr-FR"/>
-        </w:rPr>
-        <w:t xml:space="preserve"> faites</w:t>
-      </w:r>
-      <w:r>
-        <w:rPr>
-          <w:lang w:val="fr-FR"/>
-        </w:rPr>
-        <w:t xml:space="preserve"> sur </w:t>
-      </w:r>
-      <w:proofErr w:type="gramStart"/>
-      <w:r>
-        <w:rPr>
-          <w:lang w:val="fr-FR"/>
-        </w:rPr>
-        <w:t>la block</w:t>
-      </w:r>
-      <w:proofErr w:type="gramEnd"/>
-      <w:r>
-        <w:rPr>
-          <w:lang w:val="fr-FR"/>
-        </w:rPr>
-        <w:t xml:space="preserve"> </w:t>
-      </w:r>
-      <w:proofErr w:type="spellStart"/>
-      <w:r>
-        <w:rPr>
-          <w:lang w:val="fr-FR"/>
-        </w:rPr>
-        <w:t>chain</w:t>
-      </w:r>
-      <w:proofErr w:type="spellEnd"/>
-      <w:r>
-        <w:rPr>
           <w:lang w:val="fr-FR"/>
         </w:rPr>
         <w:t xml:space="preserve">) </w:t>
@@ -2433,6 +2347,7 @@
       </w:pPr>
       <w:r>
         <w:rPr>
+          <w:noProof/>
           <w:lang w:val="fr-FR"/>
         </w:rPr>
         <w:drawing>
@@ -2638,21 +2553,7 @@
         <w:rPr>
           <w:lang w:val="fr-FR"/>
         </w:rPr>
-        <w:t xml:space="preserve"> est chainé avec le hash de la transaction précédente) si ce dernier ne correspond pas au hash indexé sur </w:t>
-      </w:r>
-      <w:proofErr w:type="gramStart"/>
-      <w:r>
-        <w:rPr>
-          <w:lang w:val="fr-FR"/>
-        </w:rPr>
-        <w:t>la block</w:t>
-      </w:r>
-      <w:proofErr w:type="gramEnd"/>
-      <w:r>
-        <w:rPr>
-          <w:lang w:val="fr-FR"/>
-        </w:rPr>
-        <w:t xml:space="preserve"> </w:t>
+        <w:t xml:space="preserve"> est chainé avec le hash de la transaction précédente) si ce dernier ne correspond pas au hash indexé sur la block </w:t>
       </w:r>
       <w:proofErr w:type="spellStart"/>
       <w:r>
@@ -2710,6 +2611,7 @@
       </w:pPr>
       <w:r>
         <w:rPr>
+          <w:noProof/>
           <w:lang w:val="fr-FR"/>
         </w:rPr>
         <w:drawing>
@@ -2814,19 +2716,11 @@
                 <w:lang w:val="fr-FR"/>
               </w:rPr>
             </w:pPr>
-            <w:proofErr w:type="gramStart"/>
             <w:r>
               <w:rPr>
                 <w:lang w:val="fr-FR"/>
               </w:rPr>
-              <w:t>Montant  50</w:t>
-            </w:r>
-            <w:proofErr w:type="gramEnd"/>
-            <w:r>
-              <w:rPr>
-                <w:lang w:val="fr-FR"/>
-              </w:rPr>
-              <w:t xml:space="preserve"> </w:t>
+              <w:t xml:space="preserve">Montant  50 </w:t>
             </w:r>
           </w:p>
           <w:p>
@@ -2884,21 +2778,7 @@
               <w:rPr>
                 <w:lang w:val="fr-FR"/>
               </w:rPr>
-              <w:t xml:space="preserve">Hash des infos de </w:t>
-            </w:r>
-            <w:proofErr w:type="gramStart"/>
-            <w:r>
-              <w:rPr>
-                <w:lang w:val="fr-FR"/>
-              </w:rPr>
-              <w:t>transaction  :</w:t>
-            </w:r>
-            <w:proofErr w:type="gramEnd"/>
-            <w:r>
-              <w:rPr>
-                <w:lang w:val="fr-FR"/>
-              </w:rPr>
-              <w:t xml:space="preserve"> </w:t>
+              <w:t xml:space="preserve">Hash des infos de transaction  : </w:t>
             </w:r>
             <w:r>
               <w:rPr>
@@ -2919,17 +2799,12 @@
               <w:t xml:space="preserve">Hash </w:t>
             </w:r>
             <w:proofErr w:type="spellStart"/>
-            <w:proofErr w:type="gramStart"/>
             <w:r>
               <w:t>chainé</w:t>
             </w:r>
             <w:proofErr w:type="spellEnd"/>
             <w:r>
-              <w:t> :</w:t>
-            </w:r>
-            <w:proofErr w:type="gramEnd"/>
-            <w:r>
-              <w:t xml:space="preserve"> null</w:t>
+              <w:t> : null</w:t>
             </w:r>
           </w:p>
         </w:tc>
@@ -2945,21 +2820,12 @@
                 <w:lang w:val="fr-FR"/>
               </w:rPr>
             </w:pPr>
-            <w:proofErr w:type="gramStart"/>
             <w:r>
               <w:rPr>
                 <w:u w:val="single"/>
                 <w:lang w:val="fr-FR"/>
               </w:rPr>
-              <w:t>transaction</w:t>
-            </w:r>
-            <w:proofErr w:type="gramEnd"/>
-            <w:r>
-              <w:rPr>
-                <w:u w:val="single"/>
-                <w:lang w:val="fr-FR"/>
-              </w:rPr>
-              <w:t xml:space="preserve"> 2</w:t>
+              <w:t>transaction 2</w:t>
             </w:r>
           </w:p>
           <w:p>
@@ -2975,7 +2841,6 @@
                 <w:lang w:val="fr-FR"/>
               </w:rPr>
             </w:pPr>
-            <w:proofErr w:type="gramStart"/>
             <w:r>
               <w:rPr>
                 <w:lang w:val="fr-FR"/>
@@ -2986,14 +2851,7 @@
               <w:rPr>
                 <w:lang w:val="fr-FR"/>
               </w:rPr>
-              <w:t>-</w:t>
-            </w:r>
-            <w:proofErr w:type="gramEnd"/>
-            <w:r>
-              <w:rPr>
-                <w:lang w:val="fr-FR"/>
-              </w:rPr>
-              <w:t xml:space="preserve"> 2</w:t>
+              <w:t>- 2</w:t>
             </w:r>
             <w:r>
               <w:rPr>
@@ -3069,21 +2927,7 @@
               <w:rPr>
                 <w:lang w:val="fr-FR"/>
               </w:rPr>
-              <w:t xml:space="preserve">Hash des infos de </w:t>
-            </w:r>
-            <w:proofErr w:type="gramStart"/>
-            <w:r>
-              <w:rPr>
-                <w:lang w:val="fr-FR"/>
-              </w:rPr>
-              <w:t>transaction  :</w:t>
-            </w:r>
-            <w:proofErr w:type="gramEnd"/>
-            <w:r>
-              <w:rPr>
-                <w:lang w:val="fr-FR"/>
-              </w:rPr>
-              <w:t xml:space="preserve"> </w:t>
+              <w:t xml:space="preserve">Hash des infos de transaction  : </w:t>
             </w:r>
             <w:r>
               <w:rPr>
@@ -3104,25 +2948,18 @@
               <w:t xml:space="preserve">Hash </w:t>
             </w:r>
             <w:proofErr w:type="spellStart"/>
-            <w:proofErr w:type="gramStart"/>
             <w:r>
               <w:t>chainé</w:t>
             </w:r>
             <w:proofErr w:type="spellEnd"/>
             <w:r>
-              <w:t> :</w:t>
-            </w:r>
-            <w:proofErr w:type="gramEnd"/>
-            <w:r>
-              <w:t xml:space="preserve"> </w:t>
+              <w:t xml:space="preserve"> : </w:t>
             </w:r>
           </w:p>
           <w:p>
-            <w:proofErr w:type="gramStart"/>
             <w:r>
               <w:t>Hash(</w:t>
             </w:r>
-            <w:proofErr w:type="gramEnd"/>
             <w:r>
               <w:t>BBBBBBB</w:t>
             </w:r>
@@ -3157,21 +2994,12 @@
                 <w:lang w:val="fr-FR"/>
               </w:rPr>
             </w:pPr>
-            <w:proofErr w:type="gramStart"/>
             <w:r>
               <w:rPr>
                 <w:u w:val="single"/>
                 <w:lang w:val="fr-FR"/>
               </w:rPr>
-              <w:t>transaction</w:t>
-            </w:r>
-            <w:proofErr w:type="gramEnd"/>
-            <w:r>
-              <w:rPr>
-                <w:u w:val="single"/>
-                <w:lang w:val="fr-FR"/>
-              </w:rPr>
-              <w:t xml:space="preserve"> </w:t>
+              <w:t xml:space="preserve">transaction </w:t>
             </w:r>
             <w:r>
               <w:rPr>
@@ -3194,7 +3022,6 @@
                 <w:lang w:val="fr-FR"/>
               </w:rPr>
             </w:pPr>
-            <w:proofErr w:type="gramStart"/>
             <w:r>
               <w:rPr>
                 <w:lang w:val="fr-FR"/>
@@ -3205,14 +3032,7 @@
               <w:rPr>
                 <w:lang w:val="fr-FR"/>
               </w:rPr>
-              <w:t>+</w:t>
-            </w:r>
-            <w:proofErr w:type="gramEnd"/>
-            <w:r>
-              <w:rPr>
-                <w:lang w:val="fr-FR"/>
-              </w:rPr>
-              <w:t>15</w:t>
+              <w:t>+15</w:t>
             </w:r>
             <w:r>
               <w:rPr>
@@ -3288,21 +3108,7 @@
               <w:rPr>
                 <w:lang w:val="fr-FR"/>
               </w:rPr>
-              <w:t xml:space="preserve">Hash des infos de </w:t>
-            </w:r>
-            <w:proofErr w:type="gramStart"/>
-            <w:r>
-              <w:rPr>
-                <w:lang w:val="fr-FR"/>
-              </w:rPr>
-              <w:t>transaction  :</w:t>
-            </w:r>
-            <w:proofErr w:type="gramEnd"/>
-            <w:r>
-              <w:rPr>
-                <w:lang w:val="fr-FR"/>
-              </w:rPr>
-              <w:t xml:space="preserve"> </w:t>
+              <w:t xml:space="preserve">Hash des infos de transaction  : </w:t>
             </w:r>
             <w:r>
               <w:rPr>
@@ -3323,25 +3129,18 @@
               <w:t xml:space="preserve">Hash </w:t>
             </w:r>
             <w:proofErr w:type="spellStart"/>
-            <w:proofErr w:type="gramStart"/>
             <w:r>
               <w:t>chainé</w:t>
             </w:r>
             <w:proofErr w:type="spellEnd"/>
             <w:r>
-              <w:t> :</w:t>
-            </w:r>
-            <w:proofErr w:type="gramEnd"/>
-            <w:r>
-              <w:t xml:space="preserve"> </w:t>
+              <w:t xml:space="preserve"> : </w:t>
             </w:r>
           </w:p>
           <w:p>
-            <w:proofErr w:type="gramStart"/>
             <w:r>
               <w:t>Hash(</w:t>
             </w:r>
-            <w:proofErr w:type="gramEnd"/>
             <w:r>
               <w:t>CCCCCCCC</w:t>
             </w:r>
@@ -3415,16 +3214,8 @@
         <w:rPr>
           <w:lang w:val="fr-FR"/>
         </w:rPr>
-        <w:t xml:space="preserve"> et lui demander le hash chainé de la transaction </w:t>
-      </w:r>
-      <w:proofErr w:type="gramStart"/>
-      <w:r>
-        <w:rPr>
-          <w:lang w:val="fr-FR"/>
-        </w:rPr>
-        <w:t>2  (</w:t>
-      </w:r>
-      <w:proofErr w:type="gramEnd"/>
+        <w:t xml:space="preserve"> et lui demander le hash chainé de la transaction 2  (</w:t>
+      </w:r>
       <w:r>
         <w:rPr>
           <w:lang w:val="fr-FR"/>
@@ -3462,21 +3253,7 @@
         <w:rPr>
           <w:lang w:val="fr-FR"/>
         </w:rPr>
-        <w:t xml:space="preserve"> va alors retrouver la transaction faite par ce tiers sur </w:t>
-      </w:r>
-      <w:proofErr w:type="gramStart"/>
-      <w:r>
-        <w:rPr>
-          <w:lang w:val="fr-FR"/>
-        </w:rPr>
-        <w:t>la block</w:t>
-      </w:r>
-      <w:proofErr w:type="gramEnd"/>
-      <w:r>
-        <w:rPr>
-          <w:lang w:val="fr-FR"/>
-        </w:rPr>
-        <w:t xml:space="preserve"> </w:t>
+        <w:t xml:space="preserve"> va alors retrouver la transaction faite par ce tiers sur la block </w:t>
       </w:r>
       <w:proofErr w:type="spellStart"/>
       <w:r>
@@ -3605,6 +3382,7 @@
       </w:pPr>
       <w:r>
         <w:rPr>
+          <w:noProof/>
           <w:lang w:val="fr-FR"/>
         </w:rPr>
         <w:drawing>
@@ -3716,6 +3494,7 @@
         <w:rPr>
           <w:b/>
           <w:bCs/>
+          <w:noProof/>
           <w:lang w:val="fr-FR"/>
         </w:rPr>
         <w:drawing>
@@ -4380,6 +4159,7 @@
       </w:pPr>
       <w:r>
         <w:rPr>
+          <w:noProof/>
           <w:lang w:val="fr-FR"/>
         </w:rPr>
         <w:drawing>
@@ -4491,6 +4271,176 @@
     <w:p>
       <w:pPr>
         <w:rPr>
+          <w:b/>
+          <w:bCs/>
+          <w:lang w:val="fr-FR"/>
+        </w:rPr>
+      </w:pPr>
+      <w:r>
+        <w:rPr>
+          <w:b/>
+          <w:bCs/>
+          <w:lang w:val="fr-FR"/>
+        </w:rPr>
+        <w:t>Mais</w:t>
+      </w:r>
+      <w:r>
+        <w:rPr>
+          <w:b/>
+          <w:bCs/>
+          <w:lang w:val="fr-FR"/>
+        </w:rPr>
+        <w:t xml:space="preserve"> m’en </w:t>
+      </w:r>
+      <w:proofErr w:type="spellStart"/>
+      <w:r>
+        <w:rPr>
+          <w:b/>
+          <w:bCs/>
+          <w:lang w:val="fr-FR"/>
+        </w:rPr>
+        <w:t>tap</w:t>
+      </w:r>
+      <w:proofErr w:type="spellEnd"/>
+      <w:r>
+        <w:rPr>
+          <w:b/>
+          <w:bCs/>
+          <w:lang w:val="fr-FR"/>
+        </w:rPr>
+        <w:t xml:space="preserve"> </w:t>
+      </w:r>
+      <w:r>
+        <w:rPr>
+          <w:b/>
+          <w:bCs/>
+          <w:lang w:val="fr-FR"/>
+        </w:rPr>
+        <w:t xml:space="preserve">actuellement </w:t>
+      </w:r>
+      <w:r>
+        <w:rPr>
+          <w:b/>
+          <w:bCs/>
+          <w:lang w:val="fr-FR"/>
+        </w:rPr>
+        <w:t xml:space="preserve">  </w:t>
+      </w:r>
+      <w:r>
+        <w:rPr>
+          <w:b/>
+          <w:bCs/>
+          <w:lang w:val="fr-FR"/>
+        </w:rPr>
+        <w:t xml:space="preserve">e totalement les burnes des systèmes décentralisés qui je dois dire ont obnubilé mon quotidien des années </w:t>
+      </w:r>
+      <w:r>
+        <w:rPr>
+          <w:b/>
+          <w:bCs/>
+          <w:lang w:val="fr-FR"/>
+        </w:rPr>
+        <w:t>durant.</w:t>
+      </w:r>
+      <w:r>
+        <w:rPr>
+          <w:b/>
+          <w:bCs/>
+          <w:lang w:val="fr-FR"/>
+        </w:rPr>
+        <w:t xml:space="preserve"> </w:t>
+      </w:r>
+    </w:p>
+    <w:p>
+      <w:pPr>
+        <w:rPr>
+          <w:b/>
+          <w:bCs/>
+          <w:lang w:val="fr-FR"/>
+        </w:rPr>
+      </w:pPr>
+      <w:r>
+        <w:rPr>
+          <w:b/>
+          <w:bCs/>
+          <w:lang w:val="fr-FR"/>
+        </w:rPr>
+        <w:t xml:space="preserve">Next </w:t>
+      </w:r>
+      <w:proofErr w:type="spellStart"/>
+      <w:r>
+        <w:rPr>
+          <w:b/>
+          <w:bCs/>
+          <w:lang w:val="fr-FR"/>
+        </w:rPr>
+        <w:t>step</w:t>
+      </w:r>
+      <w:proofErr w:type="spellEnd"/>
+      <w:r>
+        <w:rPr>
+          <w:b/>
+          <w:bCs/>
+          <w:lang w:val="fr-FR"/>
+        </w:rPr>
+        <w:t xml:space="preserve"> les </w:t>
+      </w:r>
+      <w:proofErr w:type="spellStart"/>
+      <w:r>
+        <w:rPr>
+          <w:b/>
+          <w:bCs/>
+          <w:lang w:val="fr-FR"/>
+        </w:rPr>
+        <w:t>systemes</w:t>
+      </w:r>
+      <w:proofErr w:type="spellEnd"/>
+      <w:r>
+        <w:rPr>
+          <w:b/>
+          <w:bCs/>
+          <w:lang w:val="fr-FR"/>
+        </w:rPr>
+        <w:t xml:space="preserve"> Ia reposant comme principe actif </w:t>
+      </w:r>
+      <w:r>
+        <w:rPr>
+          <w:b/>
+          <w:bCs/>
+          <w:lang w:val="fr-FR"/>
+        </w:rPr>
+        <w:t xml:space="preserve">f(x)  = </w:t>
+      </w:r>
+      <w:proofErr w:type="spellStart"/>
+      <w:r>
+        <w:rPr>
+          <w:b/>
+          <w:bCs/>
+          <w:lang w:val="fr-FR"/>
+        </w:rPr>
+        <w:t>segmoid</w:t>
+      </w:r>
+      <w:r>
+        <w:rPr>
+          <w:b/>
+          <w:bCs/>
+          <w:lang w:val="fr-FR"/>
+        </w:rPr>
+        <w:t>e</w:t>
+      </w:r>
+      <w:proofErr w:type="spellEnd"/>
+      <w:r>
+        <w:rPr>
+          <w:b/>
+          <w:bCs/>
+          <w:lang w:val="fr-FR"/>
+        </w:rPr>
+        <w:t xml:space="preserve"> </w:t>
+      </w:r>
+    </w:p>
+    <w:p>
+      <w:pPr>
+        <w:rPr>
           <w:lang w:val="fr-FR"/>
         </w:rPr>
       </w:pPr>
@@ -4533,7 +4483,7 @@
 </file>
 
 <file path=word/numbering.xml><?xml version="1.0" encoding="utf-8"?>
-<w:numbering xmlns:wpc="http://schemas.microsoft.com/office/word/2010/wordprocessingCanvas" xmlns:cx="http://schemas.microsoft.com/office/drawing/2014/chartex" xmlns:cx1="http://schemas.microsoft.com/office/drawing/2015/9/8/chartex" xmlns:cx2="http://schemas.microsoft.com/office/drawing/2015/10/21/chartex" xmlns:cx3="http://schemas.microsoft.com/office/drawing/2016/5/9/chartex" xmlns:cx4="http://schemas.microsoft.com/office/drawing/2016/5/10/chartex" xmlns:cx5="http://schemas.microsoft.com/office/drawing/2016/5/11/chartex" xmlns:cx6="http://schemas.microsoft.com/office/drawing/2016/5/12/chartex" xmlns:cx7="http://schemas.microsoft.com/office/drawing/2016/5/13/chartex" xmlns:cx8="http://schemas.microsoft.com/office/drawing/2016/5/14/chartex" xmlns:mc="http://schemas.openxmlformats.org/markup-compatibility/2006" xmlns:aink="http://schemas.microsoft.com/office/drawing/2016/ink" xmlns:am3d="http://schemas.microsoft.com/office/drawing/2017/model3d" xmlns:o="urn:schemas-microsoft-com:office:office" xmlns:oel="http://schemas.microsoft.com/office/2019/extlst" xmlns:r="http://schemas.openxmlformats.org/officeDocument/2006/relationships" xmlns:m="http://schemas.openxmlformats.org/officeDocument/2006/math" xmlns:v="urn:schemas-microsoft-com:vml" xmlns:wp14="http://schemas.microsoft.com/office/word/2010/wordprocessingDrawing" xmlns:wp="http://schemas.openxmlformats.org/drawingml/2006/wordprocessingDrawing" xmlns:w10="urn:schemas-microsoft-com:office:word" xmlns:w="http://schemas.openxmlformats.org/wordprocessingml/2006/main" xmlns:w14="http://schemas.microsoft.com/office/word/2010/wordml" xmlns:w15="http://schemas.microsoft.com/office/word/2012/wordml" xmlns:w16cex="http://schemas.microsoft.com/office/word/2018/wordml/cex" xmlns:w16cid="http://schemas.microsoft.com/office/word/2016/wordml/cid" xmlns:w16="http://schemas.microsoft.com/office/word/2018/wordml" xmlns:w16du="http://schemas.microsoft.com/office/word/2023/wordml/word16du" xmlns:w16sdtdh="http://schemas.microsoft.com/office/word/2020/wordml/sdtdatahash" xmlns:w16se="http://schemas.microsoft.com/office/word/2015/wordml/symex" xmlns:wpg="http://schemas.microsoft.com/office/word/2010/wordprocessingGroup" xmlns:wpi="http://schemas.microsoft.com/office/word/2010/wordprocessingInk" xmlns:wne="http://schemas.microsoft.com/office/word/2006/wordml" xmlns:wps="http://schemas.microsoft.com/office/word/2010/wordprocessingShape" mc:Ignorable="w14 w15 w16se w16cid w16 w16cex w16sdtdh w16du wp14">
+<w:numbering xmlns:wpc="http://schemas.microsoft.com/office/word/2010/wordprocessingCanvas" xmlns:cx="http://schemas.microsoft.com/office/drawing/2014/chartex" xmlns:cx1="http://schemas.microsoft.com/office/drawing/2015/9/8/chartex" xmlns:cx2="http://schemas.microsoft.com/office/drawing/2015/10/21/chartex" xmlns:cx3="http://schemas.microsoft.com/office/drawing/2016/5/9/chartex" xmlns:cx4="http://schemas.microsoft.com/office/drawing/2016/5/10/chartex" xmlns:cx5="http://schemas.microsoft.com/office/drawing/2016/5/11/chartex" xmlns:cx6="http://schemas.microsoft.com/office/drawing/2016/5/12/chartex" xmlns:cx7="http://schemas.microsoft.com/office/drawing/2016/5/13/chartex" xmlns:cx8="http://schemas.microsoft.com/office/drawing/2016/5/14/chartex" xmlns:mc="http://schemas.openxmlformats.org/markup-compatibility/2006" xmlns:aink="http://schemas.microsoft.com/office/drawing/2016/ink" xmlns:am3d="http://schemas.microsoft.com/office/drawing/2017/model3d" xmlns:o="urn:schemas-microsoft-com:office:office" xmlns:oel="http://schemas.microsoft.com/office/2019/extlst" xmlns:r="http://schemas.openxmlformats.org/officeDocument/2006/relationships" xmlns:m="http://schemas.openxmlformats.org/officeDocument/2006/math" xmlns:v="urn:schemas-microsoft-com:vml" xmlns:wp14="http://schemas.microsoft.com/office/word/2010/wordprocessingDrawing" xmlns:wp="http://schemas.openxmlformats.org/drawingml/2006/wordprocessingDrawing" xmlns:w10="urn:schemas-microsoft-com:office:word" xmlns:w="http://schemas.openxmlformats.org/wordprocessingml/2006/main" xmlns:w14="http://schemas.microsoft.com/office/word/2010/wordml" xmlns:w15="http://schemas.microsoft.com/office/word/2012/wordml" xmlns:w16cex="http://schemas.microsoft.com/office/word/2018/wordml/cex" xmlns:w16cid="http://schemas.microsoft.com/office/word/2016/wordml/cid" xmlns:w16="http://schemas.microsoft.com/office/word/2018/wordml" xmlns:w16du="http://schemas.microsoft.com/office/word/2023/wordml/word16du" xmlns:w16sdtdh="http://schemas.microsoft.com/office/word/2020/wordml/sdtdatahash" xmlns:w16sdtfl="http://schemas.microsoft.com/office/word/2024/wordml/sdtformatlock" xmlns:w16se="http://schemas.microsoft.com/office/word/2015/wordml/symex" xmlns:wpg="http://schemas.microsoft.com/office/word/2010/wordprocessingGroup" xmlns:wpi="http://schemas.microsoft.com/office/word/2010/wordprocessingInk" xmlns:wne="http://schemas.microsoft.com/office/word/2006/wordml" xmlns:wps="http://schemas.microsoft.com/office/word/2010/wordprocessingShape" mc:Ignorable="w14 w15 w16se w16cid w16 w16cex w16sdtdh w16sdtfl w16du wp14">
   <w:abstractNum w:abstractNumId="0" w15:restartNumberingAfterBreak="0">
     <w:nsid w:val="1DC536CA"/>
     <w:multiLevelType w:val="hybridMultilevel"/>
@@ -4862,7 +4812,7 @@
 </file>
 
 <file path=word/styles.xml><?xml version="1.0" encoding="utf-8"?>
-<w:styles xmlns:mc="http://schemas.openxmlformats.org/markup-compatibility/2006" xmlns:r="http://schemas.openxmlformats.org/officeDocument/2006/relationships" xmlns:w="http://schemas.openxmlformats.org/wordprocessingml/2006/main" xmlns:w14="http://schemas.microsoft.com/office/word/2010/wordml" xmlns:w15="http://schemas.microsoft.com/office/word/2012/wordml" xmlns:w16cex="http://schemas.microsoft.com/office/word/2018/wordml/cex" xmlns:w16cid="http://schemas.microsoft.com/office/word/2016/wordml/cid" xmlns:w16="http://schemas.microsoft.com/office/word/2018/wordml" xmlns:w16du="http://schemas.microsoft.com/office/word/2023/wordml/word16du" xmlns:w16sdtdh="http://schemas.microsoft.com/office/word/2020/wordml/sdtdatahash" xmlns:w16se="http://schemas.microsoft.com/office/word/2015/wordml/symex" mc:Ignorable="w14 w15 w16se w16cid w16 w16cex w16sdtdh w16du">
+<w:styles xmlns:mc="http://schemas.openxmlformats.org/markup-compatibility/2006" xmlns:r="http://schemas.openxmlformats.org/officeDocument/2006/relationships" xmlns:w="http://schemas.openxmlformats.org/wordprocessingml/2006/main" xmlns:w14="http://schemas.microsoft.com/office/word/2010/wordml" xmlns:w15="http://schemas.microsoft.com/office/word/2012/wordml" xmlns:w16cex="http://schemas.microsoft.com/office/word/2018/wordml/cex" xmlns:w16cid="http://schemas.microsoft.com/office/word/2016/wordml/cid" xmlns:w16="http://schemas.microsoft.com/office/word/2018/wordml" xmlns:w16du="http://schemas.microsoft.com/office/word/2023/wordml/word16du" xmlns:w16sdtdh="http://schemas.microsoft.com/office/word/2020/wordml/sdtdatahash" xmlns:w16sdtfl="http://schemas.microsoft.com/office/word/2024/wordml/sdtformatlock" xmlns:w16se="http://schemas.microsoft.com/office/word/2015/wordml/symex" mc:Ignorable="w14 w15 w16se w16cid w16 w16cex w16sdtdh w16sdtfl w16du">
   <w:docDefaults>
     <w:rPrDefault>
       <w:rPr>

</xml_diff>